<commit_message>
feat: Update report, expand DP results to 5 epsilon levels, fix type errors
- Add # type: ignore[union-attr] to suppress python-docx Pylance false positives
- Expand comparison table to 8 cols (SVM + MLP AUC/Acc, Runtime, TVD)
- Update epsilon levels from 3 to 5 (0.1, 0.5, 1.0, 5.0, 10.0)
- Add SVM/MLP experiment logs for all epsilon levels
- Regenerate DP description JSONs and comparison chart

Co-Authored-By: Claude Sonnet 4.6 <noreply@anthropic.com>
</commit_message>
<xml_diff>
--- a/HW1/Midterm_Differentially Private Synthetic Data-HW1.docx
+++ b/HW1/Midterm_Differentially Private Synthetic Data-HW1.docx
@@ -107,7 +107,7 @@
     </w:p>
     <w:p>
       <w:r>
-        <w:t>2. 隱私預算分配 (Epsilon Setup)：設計三個級別的差異隱私保護強度，分別為 ε = 0.1 (極高度保護)、ε = 1.0 (中度保護)、ε = 10.0 (輕度保護/高實用性)。利用 PrivBayes 動態生成三組等量的高仿合成數據集。</w:t>
+        <w:t>2. 隱私預算分配 (Epsilon Setup)：設計五個級別的差異隱私保護強度，分別為 ε = 0.1（極高度保護）、ε = 0.5、ε = 1.0（中度保護）、ε = 5.0、ε = 10.0（輕度保護/高實用性）。利用 PrivBayes 動態生成五組等量（各 45,222 筆）的合成數據集，涵蓋從強隱私到高效用的完整保護力度範圍。</w:t>
       </w:r>
     </w:p>
     <w:p>
@@ -128,7 +128,7 @@
     </w:p>
     <w:p>
       <w:r>
-        <w:t>根據 MLP 模型之輸出，在相同測試條件下取得的數值如下表所示：</w:t>
+        <w:t>以下表格彙整所有實驗結果，包含 SVM 與 MLP 兩種分類器在各隱私預算 ε 下的表現，以及 TVD（Total Variation Distance，統計相似性指標，越低代表合成數據越接近真實分佈）。所有 DP 實驗皆以 TSTR（Train on Synthetic, Test on Real）方式評估。</w:t>
       </w:r>
     </w:p>
     <w:tbl>
@@ -138,49 +138,93 @@
         <w:tblLook w:firstColumn="1" w:firstRow="1" w:lastColumn="0" w:lastRow="0" w:noHBand="0" w:noVBand="1" w:val="04A0"/>
       </w:tblPr>
       <w:tblGrid>
-        <w:gridCol w:w="2160"/>
-        <w:gridCol w:w="2160"/>
-        <w:gridCol w:w="2160"/>
-        <w:gridCol w:w="2160"/>
+        <w:gridCol w:w="1080"/>
+        <w:gridCol w:w="1080"/>
+        <w:gridCol w:w="1080"/>
+        <w:gridCol w:w="1080"/>
+        <w:gridCol w:w="1080"/>
+        <w:gridCol w:w="1080"/>
+        <w:gridCol w:w="1080"/>
+        <w:gridCol w:w="1080"/>
       </w:tblGrid>
       <w:tr>
         <w:tc>
           <w:tcPr>
-            <w:tcW w:type="dxa" w:w="2160"/>
+            <w:tcW w:type="dxa" w:w="1080"/>
           </w:tcPr>
           <w:p>
             <w:r>
-              <w:t>評估方法分類</w:t>
+              <w:t>方法</w:t>
             </w:r>
           </w:p>
         </w:tc>
         <w:tc>
           <w:tcPr>
-            <w:tcW w:type="dxa" w:w="2160"/>
+            <w:tcW w:type="dxa" w:w="1080"/>
           </w:tcPr>
           <w:p>
             <w:r>
-              <w:t>參數設定 (Parameter)</w:t>
+              <w:t>參數</w:t>
             </w:r>
           </w:p>
         </w:tc>
         <w:tc>
           <w:tcPr>
-            <w:tcW w:type="dxa" w:w="2160"/>
+            <w:tcW w:type="dxa" w:w="1080"/>
           </w:tcPr>
           <w:p>
             <w:r>
-              <w:t>AUC 分數</w:t>
+              <w:t>Runtime (s)</w:t>
             </w:r>
           </w:p>
         </w:tc>
         <w:tc>
           <w:tcPr>
-            <w:tcW w:type="dxa" w:w="2160"/>
+            <w:tcW w:type="dxa" w:w="1080"/>
           </w:tcPr>
           <w:p>
             <w:r>
-              <w:t>準確度 (Accuracy)</w:t>
+              <w:t>TVD ↓</w:t>
+            </w:r>
+          </w:p>
+        </w:tc>
+        <w:tc>
+          <w:tcPr>
+            <w:tcW w:type="dxa" w:w="1080"/>
+          </w:tcPr>
+          <w:p>
+            <w:r>
+              <w:t>SVM AUC</w:t>
+            </w:r>
+          </w:p>
+        </w:tc>
+        <w:tc>
+          <w:tcPr>
+            <w:tcW w:type="dxa" w:w="1080"/>
+          </w:tcPr>
+          <w:p>
+            <w:r>
+              <w:t>SVM Acc</w:t>
+            </w:r>
+          </w:p>
+        </w:tc>
+        <w:tc>
+          <w:tcPr>
+            <w:tcW w:type="dxa" w:w="1080"/>
+          </w:tcPr>
+          <w:p>
+            <w:r>
+              <w:t>MLP AUC</w:t>
+            </w:r>
+          </w:p>
+        </w:tc>
+        <w:tc>
+          <w:tcPr>
+            <w:tcW w:type="dxa" w:w="1080"/>
+          </w:tcPr>
+          <w:p>
+            <w:r>
+              <w:t>MLP Acc</w:t>
             </w:r>
           </w:p>
         </w:tc>
@@ -188,7 +232,7 @@
       <w:tr>
         <w:tc>
           <w:tcPr>
-            <w:tcW w:type="dxa" w:w="2160"/>
+            <w:tcW w:type="dxa" w:w="1080"/>
           </w:tcPr>
           <w:p>
             <w:r>
@@ -198,17 +242,57 @@
         </w:tc>
         <w:tc>
           <w:tcPr>
-            <w:tcW w:type="dxa" w:w="2160"/>
+            <w:tcW w:type="dxa" w:w="1080"/>
           </w:tcPr>
           <w:p>
             <w:r>
-              <w:t>Original Dataset</w:t>
+              <w:t>Original</w:t>
             </w:r>
           </w:p>
         </w:tc>
         <w:tc>
           <w:tcPr>
-            <w:tcW w:type="dxa" w:w="2160"/>
+            <w:tcW w:type="dxa" w:w="1080"/>
+          </w:tcPr>
+          <w:p>
+            <w:r>
+              <w:t>—</w:t>
+            </w:r>
+          </w:p>
+        </w:tc>
+        <w:tc>
+          <w:tcPr>
+            <w:tcW w:type="dxa" w:w="1080"/>
+          </w:tcPr>
+          <w:p>
+            <w:r>
+              <w:t>—</w:t>
+            </w:r>
+          </w:p>
+        </w:tc>
+        <w:tc>
+          <w:tcPr>
+            <w:tcW w:type="dxa" w:w="1080"/>
+          </w:tcPr>
+          <w:p>
+            <w:r>
+              <w:t>0.9200</w:t>
+            </w:r>
+          </w:p>
+        </w:tc>
+        <w:tc>
+          <w:tcPr>
+            <w:tcW w:type="dxa" w:w="1080"/>
+          </w:tcPr>
+          <w:p>
+            <w:r>
+              <w:t>0.8580</w:t>
+            </w:r>
+          </w:p>
+        </w:tc>
+        <w:tc>
+          <w:tcPr>
+            <w:tcW w:type="dxa" w:w="1080"/>
           </w:tcPr>
           <w:p>
             <w:r>
@@ -218,7 +302,7 @@
         </w:tc>
         <w:tc>
           <w:tcPr>
-            <w:tcW w:type="dxa" w:w="2160"/>
+            <w:tcW w:type="dxa" w:w="1080"/>
           </w:tcPr>
           <w:p>
             <w:r>
@@ -230,27 +314,67 @@
       <w:tr>
         <w:tc>
           <w:tcPr>
-            <w:tcW w:type="dxa" w:w="2160"/>
+            <w:tcW w:type="dxa" w:w="1080"/>
           </w:tcPr>
           <w:p>
             <w:r>
-              <w:t>取平均參考 (HW1)</w:t>
+              <w:t>K-Anonymity (HW1)</w:t>
             </w:r>
           </w:p>
         </w:tc>
         <w:tc>
           <w:tcPr>
-            <w:tcW w:type="dxa" w:w="2160"/>
+            <w:tcW w:type="dxa" w:w="1080"/>
           </w:tcPr>
           <w:p>
             <w:r>
-              <w:t>K-Anonymity (K=10)</w:t>
+              <w:t>K = 10</w:t>
             </w:r>
           </w:p>
         </w:tc>
         <w:tc>
           <w:tcPr>
-            <w:tcW w:type="dxa" w:w="2160"/>
+            <w:tcW w:type="dxa" w:w="1080"/>
+          </w:tcPr>
+          <w:p>
+            <w:r>
+              <w:t>—</w:t>
+            </w:r>
+          </w:p>
+        </w:tc>
+        <w:tc>
+          <w:tcPr>
+            <w:tcW w:type="dxa" w:w="1080"/>
+          </w:tcPr>
+          <w:p>
+            <w:r>
+              <w:t>—</w:t>
+            </w:r>
+          </w:p>
+        </w:tc>
+        <w:tc>
+          <w:tcPr>
+            <w:tcW w:type="dxa" w:w="1080"/>
+          </w:tcPr>
+          <w:p>
+            <w:r>
+              <w:t>0.9085</w:t>
+            </w:r>
+          </w:p>
+        </w:tc>
+        <w:tc>
+          <w:tcPr>
+            <w:tcW w:type="dxa" w:w="1080"/>
+          </w:tcPr>
+          <w:p>
+            <w:r>
+              <w:t>0.8517</w:t>
+            </w:r>
+          </w:p>
+        </w:tc>
+        <w:tc>
+          <w:tcPr>
+            <w:tcW w:type="dxa" w:w="1080"/>
           </w:tcPr>
           <w:p>
             <w:r>
@@ -260,7 +384,7 @@
         </w:tc>
         <w:tc>
           <w:tcPr>
-            <w:tcW w:type="dxa" w:w="2160"/>
+            <w:tcW w:type="dxa" w:w="1080"/>
           </w:tcPr>
           <w:p>
             <w:r>
@@ -272,41 +396,81 @@
       <w:tr>
         <w:tc>
           <w:tcPr>
-            <w:tcW w:type="dxa" w:w="2160"/>
+            <w:tcW w:type="dxa" w:w="1080"/>
           </w:tcPr>
           <w:p>
             <w:r>
-              <w:t>合成數據 (期中)</w:t>
+              <w:t>DP Synthetic</w:t>
             </w:r>
           </w:p>
         </w:tc>
         <w:tc>
           <w:tcPr>
-            <w:tcW w:type="dxa" w:w="2160"/>
+            <w:tcW w:type="dxa" w:w="1080"/>
           </w:tcPr>
           <w:p>
             <w:r>
-              <w:t>DP (ε = 10.0)</w:t>
+              <w:t>ε = 10.0 (低保護)</w:t>
             </w:r>
           </w:p>
         </w:tc>
         <w:tc>
           <w:tcPr>
-            <w:tcW w:type="dxa" w:w="2160"/>
+            <w:tcW w:type="dxa" w:w="1080"/>
           </w:tcPr>
           <w:p>
             <w:r>
-              <w:t>0.8774</w:t>
+              <w:t>40.6</w:t>
             </w:r>
           </w:p>
         </w:tc>
         <w:tc>
           <w:tcPr>
-            <w:tcW w:type="dxa" w:w="2160"/>
+            <w:tcW w:type="dxa" w:w="1080"/>
           </w:tcPr>
           <w:p>
             <w:r>
-              <w:t>0.8322</w:t>
+              <w:t>0.1884</w:t>
+            </w:r>
+          </w:p>
+        </w:tc>
+        <w:tc>
+          <w:tcPr>
+            <w:tcW w:type="dxa" w:w="1080"/>
+          </w:tcPr>
+          <w:p>
+            <w:r>
+              <w:t>0.8683</w:t>
+            </w:r>
+          </w:p>
+        </w:tc>
+        <w:tc>
+          <w:tcPr>
+            <w:tcW w:type="dxa" w:w="1080"/>
+          </w:tcPr>
+          <w:p>
+            <w:r>
+              <w:t>0.8253</w:t>
+            </w:r>
+          </w:p>
+        </w:tc>
+        <w:tc>
+          <w:tcPr>
+            <w:tcW w:type="dxa" w:w="1080"/>
+          </w:tcPr>
+          <w:p>
+            <w:r>
+              <w:t>0.8881</w:t>
+            </w:r>
+          </w:p>
+        </w:tc>
+        <w:tc>
+          <w:tcPr>
+            <w:tcW w:type="dxa" w:w="1080"/>
+          </w:tcPr>
+          <w:p>
+            <w:r>
+              <w:t>0.8441</w:t>
             </w:r>
           </w:p>
         </w:tc>
@@ -314,41 +478,81 @@
       <w:tr>
         <w:tc>
           <w:tcPr>
-            <w:tcW w:type="dxa" w:w="2160"/>
+            <w:tcW w:type="dxa" w:w="1080"/>
           </w:tcPr>
           <w:p>
             <w:r>
-              <w:t>合成數據 (期中)</w:t>
+              <w:t>DP Synthetic</w:t>
             </w:r>
           </w:p>
         </w:tc>
         <w:tc>
           <w:tcPr>
-            <w:tcW w:type="dxa" w:w="2160"/>
+            <w:tcW w:type="dxa" w:w="1080"/>
           </w:tcPr>
           <w:p>
             <w:r>
-              <w:t>DP (ε = 1.0)</w:t>
+              <w:t>ε = 5.0</w:t>
             </w:r>
           </w:p>
         </w:tc>
         <w:tc>
           <w:tcPr>
-            <w:tcW w:type="dxa" w:w="2160"/>
+            <w:tcW w:type="dxa" w:w="1080"/>
           </w:tcPr>
           <w:p>
             <w:r>
-              <w:t>0.8364</w:t>
+              <w:t>38.8</w:t>
             </w:r>
           </w:p>
         </w:tc>
         <w:tc>
           <w:tcPr>
-            <w:tcW w:type="dxa" w:w="2160"/>
+            <w:tcW w:type="dxa" w:w="1080"/>
           </w:tcPr>
           <w:p>
             <w:r>
-              <w:t>0.7855</w:t>
+              <w:t>0.1902</w:t>
+            </w:r>
+          </w:p>
+        </w:tc>
+        <w:tc>
+          <w:tcPr>
+            <w:tcW w:type="dxa" w:w="1080"/>
+          </w:tcPr>
+          <w:p>
+            <w:r>
+              <w:t>0.8654</w:t>
+            </w:r>
+          </w:p>
+        </w:tc>
+        <w:tc>
+          <w:tcPr>
+            <w:tcW w:type="dxa" w:w="1080"/>
+          </w:tcPr>
+          <w:p>
+            <w:r>
+              <w:t>0.8216</w:t>
+            </w:r>
+          </w:p>
+        </w:tc>
+        <w:tc>
+          <w:tcPr>
+            <w:tcW w:type="dxa" w:w="1080"/>
+          </w:tcPr>
+          <w:p>
+            <w:r>
+              <w:t>0.8918</w:t>
+            </w:r>
+          </w:p>
+        </w:tc>
+        <w:tc>
+          <w:tcPr>
+            <w:tcW w:type="dxa" w:w="1080"/>
+          </w:tcPr>
+          <w:p>
+            <w:r>
+              <w:t>0.8448</w:t>
             </w:r>
           </w:p>
         </w:tc>
@@ -356,41 +560,245 @@
       <w:tr>
         <w:tc>
           <w:tcPr>
-            <w:tcW w:type="dxa" w:w="2160"/>
+            <w:tcW w:type="dxa" w:w="1080"/>
           </w:tcPr>
           <w:p>
             <w:r>
-              <w:t>合成數據 (期中)</w:t>
+              <w:t>DP Synthetic</w:t>
             </w:r>
           </w:p>
         </w:tc>
         <w:tc>
           <w:tcPr>
-            <w:tcW w:type="dxa" w:w="2160"/>
+            <w:tcW w:type="dxa" w:w="1080"/>
           </w:tcPr>
           <w:p>
             <w:r>
-              <w:t>DP (ε = 0.1)</w:t>
+              <w:t>ε = 1.0</w:t>
             </w:r>
           </w:p>
         </w:tc>
         <w:tc>
           <w:tcPr>
-            <w:tcW w:type="dxa" w:w="2160"/>
+            <w:tcW w:type="dxa" w:w="1080"/>
           </w:tcPr>
           <w:p>
             <w:r>
-              <w:t>0.6953</w:t>
+              <w:t>39.6</w:t>
             </w:r>
           </w:p>
         </w:tc>
         <w:tc>
           <w:tcPr>
-            <w:tcW w:type="dxa" w:w="2160"/>
+            <w:tcW w:type="dxa" w:w="1080"/>
           </w:tcPr>
           <w:p>
             <w:r>
-              <w:t>0.7343</w:t>
+              <w:t>0.2393</w:t>
+            </w:r>
+          </w:p>
+        </w:tc>
+        <w:tc>
+          <w:tcPr>
+            <w:tcW w:type="dxa" w:w="1080"/>
+          </w:tcPr>
+          <w:p>
+            <w:r>
+              <w:t>0.8448</w:t>
+            </w:r>
+          </w:p>
+        </w:tc>
+        <w:tc>
+          <w:tcPr>
+            <w:tcW w:type="dxa" w:w="1080"/>
+          </w:tcPr>
+          <w:p>
+            <w:r>
+              <w:t>0.8153</w:t>
+            </w:r>
+          </w:p>
+        </w:tc>
+        <w:tc>
+          <w:tcPr>
+            <w:tcW w:type="dxa" w:w="1080"/>
+          </w:tcPr>
+          <w:p>
+            <w:r>
+              <w:t>0.8672</w:t>
+            </w:r>
+          </w:p>
+        </w:tc>
+        <w:tc>
+          <w:tcPr>
+            <w:tcW w:type="dxa" w:w="1080"/>
+          </w:tcPr>
+          <w:p>
+            <w:r>
+              <w:t>0.8263</w:t>
+            </w:r>
+          </w:p>
+        </w:tc>
+      </w:tr>
+      <w:tr>
+        <w:tc>
+          <w:tcPr>
+            <w:tcW w:type="dxa" w:w="1080"/>
+          </w:tcPr>
+          <w:p>
+            <w:r>
+              <w:t>DP Synthetic</w:t>
+            </w:r>
+          </w:p>
+        </w:tc>
+        <w:tc>
+          <w:tcPr>
+            <w:tcW w:type="dxa" w:w="1080"/>
+          </w:tcPr>
+          <w:p>
+            <w:r>
+              <w:t>ε = 0.5</w:t>
+            </w:r>
+          </w:p>
+        </w:tc>
+        <w:tc>
+          <w:tcPr>
+            <w:tcW w:type="dxa" w:w="1080"/>
+          </w:tcPr>
+          <w:p>
+            <w:r>
+              <w:t>40.0</w:t>
+            </w:r>
+          </w:p>
+        </w:tc>
+        <w:tc>
+          <w:tcPr>
+            <w:tcW w:type="dxa" w:w="1080"/>
+          </w:tcPr>
+          <w:p>
+            <w:r>
+              <w:t>0.2401</w:t>
+            </w:r>
+          </w:p>
+        </w:tc>
+        <w:tc>
+          <w:tcPr>
+            <w:tcW w:type="dxa" w:w="1080"/>
+          </w:tcPr>
+          <w:p>
+            <w:r>
+              <w:t>0.7098</w:t>
+            </w:r>
+          </w:p>
+        </w:tc>
+        <w:tc>
+          <w:tcPr>
+            <w:tcW w:type="dxa" w:w="1080"/>
+          </w:tcPr>
+          <w:p>
+            <w:r>
+              <w:t>0.7563</w:t>
+            </w:r>
+          </w:p>
+        </w:tc>
+        <w:tc>
+          <w:tcPr>
+            <w:tcW w:type="dxa" w:w="1080"/>
+          </w:tcPr>
+          <w:p>
+            <w:r>
+              <w:t>0.8096</w:t>
+            </w:r>
+          </w:p>
+        </w:tc>
+        <w:tc>
+          <w:tcPr>
+            <w:tcW w:type="dxa" w:w="1080"/>
+          </w:tcPr>
+          <w:p>
+            <w:r>
+              <w:t>0.7677</w:t>
+            </w:r>
+          </w:p>
+        </w:tc>
+      </w:tr>
+      <w:tr>
+        <w:tc>
+          <w:tcPr>
+            <w:tcW w:type="dxa" w:w="1080"/>
+          </w:tcPr>
+          <w:p>
+            <w:r>
+              <w:t>DP Synthetic</w:t>
+            </w:r>
+          </w:p>
+        </w:tc>
+        <w:tc>
+          <w:tcPr>
+            <w:tcW w:type="dxa" w:w="1080"/>
+          </w:tcPr>
+          <w:p>
+            <w:r>
+              <w:t>ε = 0.1 (高保護)</w:t>
+            </w:r>
+          </w:p>
+        </w:tc>
+        <w:tc>
+          <w:tcPr>
+            <w:tcW w:type="dxa" w:w="1080"/>
+          </w:tcPr>
+          <w:p>
+            <w:r>
+              <w:t>43.3</w:t>
+            </w:r>
+          </w:p>
+        </w:tc>
+        <w:tc>
+          <w:tcPr>
+            <w:tcW w:type="dxa" w:w="1080"/>
+          </w:tcPr>
+          <w:p>
+            <w:r>
+              <w:t>0.3338</w:t>
+            </w:r>
+          </w:p>
+        </w:tc>
+        <w:tc>
+          <w:tcPr>
+            <w:tcW w:type="dxa" w:w="1080"/>
+          </w:tcPr>
+          <w:p>
+            <w:r>
+              <w:t>0.7948</w:t>
+            </w:r>
+          </w:p>
+        </w:tc>
+        <w:tc>
+          <w:tcPr>
+            <w:tcW w:type="dxa" w:w="1080"/>
+          </w:tcPr>
+          <w:p>
+            <w:r>
+              <w:t>0.7347</w:t>
+            </w:r>
+          </w:p>
+        </w:tc>
+        <w:tc>
+          <w:tcPr>
+            <w:tcW w:type="dxa" w:w="1080"/>
+          </w:tcPr>
+          <w:p>
+            <w:r>
+              <w:t>0.8162</w:t>
+            </w:r>
+          </w:p>
+        </w:tc>
+        <w:tc>
+          <w:tcPr>
+            <w:tcW w:type="dxa" w:w="1080"/>
+          </w:tcPr>
+          <w:p>
+            <w:r>
+              <w:t>0.8014</w:t>
             </w:r>
           </w:p>
         </w:tc>
@@ -451,10 +859,10 @@
         <w:rPr>
           <w:b/>
         </w:rPr>
-        <w:t>適度保護 (ε=10.0)：</w:t>
+        <w:t>適度保護 (ε=10.0 / ε=5.0)：</w:t>
       </w:r>
       <w:r>
-        <w:t>在圖上可以看到，當預算放寬時，PrivBayes 合成的資料能讓機器學習維持 87.7% 的 AUC 以及 83% 的正確率。這個效能表現極具實務應用價值，相當逼近 HW1 的能力，此結論證明合成數據技術足以代替高度敏感的原始資料發布給第三方做初期研發。</w:t>
+        <w:t>當隱私預算放寬至 ε=10.0 時，MLP AUC 達 88.8%、SVM AUC 達 86.8%，Accuracy 分別為 84.4% 與 82.5%。TVD 僅 0.1884，代表合成數據的統計分佈高度貼近真實資料。此效能逼近 HW1 K-Anonymity (K=10) 的 MLP AUC 91.2%，證明 DP 合成數據足以取代高敏感原始資料供第三方研發使用。</w:t>
       </w:r>
     </w:p>
     <w:p>
@@ -465,7 +873,7 @@
         <w:t>極端防禦的代價 (ε=0.1)：</w:t>
       </w:r>
       <w:r>
-        <w:t>當預算趨近於極小，代表嚴格要求任何獨立個體的加入都不能改寫整體的貝氏機率分佈。圖中最右側柱體發生斷崖式下墜 (AUC 跌破至 0.69)。為滿足嚴苛的差異隱私數學假設，機率模型被迫加入過多的拉普拉斯噪音，破壞了變數關聯性，印證了絕對的隱私等同於部分資料開發價值的犧牲。</w:t>
+        <w:t>當 ε=0.1 時，TVD 上升至 0.3338，代表合成資料的分佈已與真實資料有明顯落差。SVM AUC 降至 79.5%、MLP AUC 降至 81.6%，Accuracy 分別為 73.5% 與 80.1%。為滿足嚴苛的差異隱私數學假設，PrivBayes 被迫加入大量 Laplace 噪音，破壞特徵間的關聯結構，印證了「絕對的隱私保護等同於部分資料價值的犧牲」。</w:t>
       </w:r>
     </w:p>
     <w:p>
@@ -480,7 +888,7 @@
       <w:r>
         <w:drawing>
           <wp:inline xmlns:a="http://schemas.openxmlformats.org/drawingml/2006/main" xmlns:pic="http://schemas.openxmlformats.org/drawingml/2006/picture">
-            <wp:extent cx="5080000" cy="2177143"/>
+            <wp:extent cx="5080000" cy="3628571"/>
             <wp:docPr id="1" name="Picture 1"/>
             <wp:cNvGraphicFramePr>
               <a:graphicFrameLocks noChangeAspect="1"/>
@@ -501,7 +909,7 @@
                   <pic:spPr>
                     <a:xfrm>
                       <a:off x="0" y="0"/>
-                      <a:ext cx="5080000" cy="2177143"/>
+                      <a:ext cx="5080000" cy="3628571"/>
                     </a:xfrm>
                     <a:prstGeom prst="rect"/>
                   </pic:spPr>

</xml_diff>